<commit_message>
feat: complete cinematic V2 platform transformation with Emergency SOS overlay, and compile-safe hackathon presentation & DOCX proposal documents
</commit_message>
<xml_diff>
--- a/RaastaSense_Hackathon_Submission.docx
+++ b/RaastaSense_Hackathon_Submission.docx
@@ -5,7 +5,36 @@
     <w:p/>
     <w:p/>
     <w:p/>
-    <w:p/>
+    <w:p>
+      <w:pPr>
+        <w:spacing w:after="120"/>
+        <w:jc w:val="center"/>
+      </w:pPr>
+      <w:r>
+        <w:rPr>
+          <w:rFonts w:ascii="Century Gothic" w:hAnsi="Century Gothic"/>
+          <w:b/>
+          <w:color w:val="0F172A"/>
+          <w:sz w:val="88"/>
+        </w:rPr>
+        <w:t>RAASTASENSE V2</w:t>
+      </w:r>
+    </w:p>
+    <w:p>
+      <w:pPr>
+        <w:spacing w:after="800"/>
+        <w:jc w:val="center"/>
+      </w:pPr>
+      <w:r>
+        <w:rPr>
+          <w:rFonts w:ascii="Century Gothic" w:hAnsi="Century Gothic"/>
+          <w:b/>
+          <w:color w:val="38BDF8"/>
+          <w:sz w:val="32"/>
+        </w:rPr>
+        <w:t>Transforming Road Safety Through Real-Time Intelligence</w:t>
+      </w:r>
+    </w:p>
     <w:p/>
     <w:p/>
     <w:p/>
@@ -16,85 +45,20 @@
       </w:pPr>
       <w:r>
         <w:rPr>
-          <w:rFonts w:ascii="Century Gothic" w:hAnsi="Century Gothic"/>
+          <w:rFonts w:ascii="Calibri" w:hAnsi="Calibri"/>
           <w:b/>
-          <w:color w:val="38BDF8"/>
-          <w:sz w:val="84"/>
-        </w:rPr>
-        <w:t>RAASTASENSE</w:t>
-      </w:r>
-    </w:p>
-    <w:p>
-      <w:pPr>
-        <w:spacing w:after="560"/>
-        <w:jc w:val="center"/>
-      </w:pPr>
-      <w:r>
-        <w:rPr>
-          <w:rFonts w:ascii="Century Gothic" w:hAnsi="Century Gothic"/>
-          <w:color w:val="1E293B"/>
-          <w:sz w:val="32"/>
-        </w:rPr>
-        <w:t>Transforming Road Safety Through Real-Time Intelligence</w:t>
-      </w:r>
-    </w:p>
-    <w:p/>
-    <w:p/>
-    <w:p/>
-    <w:p/>
-    <w:p/>
-    <w:p/>
-    <w:p>
-      <w:pPr>
-        <w:jc w:val="center"/>
-      </w:pPr>
-      <w:r>
-        <w:rPr>
-          <w:rFonts w:ascii="Century Gothic" w:hAnsi="Century Gothic"/>
-          <w:b/>
-          <w:color w:val="F59E0B"/>
+          <w:color w:val="475569"/>
           <w:sz w:val="24"/>
-        </w:rPr>
-        <w:t>SUBMISSION REPORT</w:t>
-        <w:br/>
-      </w:r>
-      <w:r>
-        <w:rPr>
-          <w:rFonts w:ascii="Century Gothic" w:hAnsi="Century Gothic"/>
-          <w:b/>
-          <w:color w:val="0F172A"/>
-          <w:sz w:val="22"/>
         </w:rPr>
         <w:t>IIT Madras Road Safety Hackathon 2026</w:t>
         <w:br/>
+        <w:t>Team: NXT-waVE</w:t>
         <w:br/>
-      </w:r>
-      <w:r>
-        <w:rPr>
-          <w:rFonts w:ascii="Century Gothic" w:hAnsi="Century Gothic"/>
-          <w:b/>
-          <w:sz w:val="22"/>
-        </w:rPr>
-        <w:t>Presented by: Team NXT-waVE</w:t>
+        <w:t>Members: AJAY RATHOD &amp; ANIMESH BHANARKAR</w:t>
         <w:br/>
-      </w:r>
-      <w:r>
-        <w:rPr>
-          <w:rFonts w:ascii="Century Gothic" w:hAnsi="Century Gothic"/>
-          <w:i/>
-          <w:sz w:val="20"/>
-        </w:rPr>
-        <w:t>Members: Ajay Rathod &amp; Animesh Bhanarkar</w:t>
+        <w:t>Live Deployment: https://raastasense.vercel.app</w:t>
         <w:br/>
-      </w:r>
-      <w:r>
-        <w:rPr>
-          <w:rFonts w:ascii="Century Gothic" w:hAnsi="Century Gothic"/>
-          <w:b/>
-          <w:color w:val="38BDF8"/>
-          <w:sz w:val="22"/>
-        </w:rPr>
-        <w:t>Live Deployed Demo: https://raastasense.vercel.app</w:t>
+        <w:t>Repository: https://github.com/Ajayrathod04/RaastaSense</w:t>
         <w:br/>
       </w:r>
     </w:p>
@@ -105,8 +69,7 @@
     </w:p>
     <w:p>
       <w:pPr>
-        <w:keepNext/>
-        <w:spacing w:before="0" w:after="120"/>
+        <w:spacing w:before="360" w:after="200"/>
       </w:pPr>
       <w:r>
         <w:rPr>
@@ -119,29 +82,8 @@
       </w:r>
     </w:p>
     <w:p>
-      <w:pPr>
-        <w:spacing w:after="120" w:line="276" w:lineRule="auto"/>
-      </w:pPr>
       <w:r>
-        <w:rPr>
-          <w:rFonts w:ascii="Calibri" w:hAnsi="Calibri"/>
-          <w:color w:val="334155"/>
-          <w:sz w:val="22"/>
-        </w:rPr>
-        <w:t>The modern road transportation grid is plagued by inefficient monitoring systems, rising accident rates, uncoordinated emergency responses, and lack of municipal works transparency. As urban density increases, reactive management strategies fail to minimize casualties, particularly within the critical 'Golden Hour' of road trauma. RaastaSense was conceptualized to address these infrastructural vulnerabilities using active real-time geospatial telemetry, decentralized citizen accountability indexes, and algorithmic routing systems.</w:t>
-      </w:r>
-    </w:p>
-    <w:p>
-      <w:pPr>
-        <w:spacing w:after="120" w:line="276" w:lineRule="auto"/>
-      </w:pPr>
-      <w:r>
-        <w:rPr>
-          <w:rFonts w:ascii="Calibri" w:hAnsi="Calibri"/>
-          <w:color w:val="334155"/>
-          <w:sz w:val="22"/>
-        </w:rPr>
-        <w:t>This proposal outlines RaastaSense—a comprehensive, production-grade Road Safety Intelligence Command Center. RaastaSense provides dynamic map visualization, a modular three-corridor Safe Route Engine, an automated legal violation index (DriveLegal) with regional surcharges, a transparent municipal works audit dashboard (RoadWatch), and a coordinate-locked rescue broadcast beacon (RoadSOS). By consolidating municipal accountability with spatial analytics, the platform aims to reduce road fatalities, enforce legal awareness, and save precious lives.</w:t>
+        <w:t>RaastaSense V2 represents a high-fidelity paradigm shift in modern road safety management. Designed specifically for the IIT Madras Road Safety Challenge, this ecosystem integrates reactive public governance trackers, predictive GIS safe route navigation, and direct satellite GPS responder coordination. Over half of road fatalities in developing nations occur during the critical 'Golden Hour' due to dispatcher routing delays and public blind spots. RaastaSense V2 addresses these challenges by transforming community vigilance into a highly transparent, actionable dashboard. With full 9-language i18n support, state-specific fine surcharges filter nodes, automated AI incident pixel categorization models, and deep coordinate locks, the platform bridges the gap between citizens, municipal agencies, and medical emergency teams.</w:t>
       </w:r>
     </w:p>
     <w:p>
@@ -151,8 +93,7 @@
     </w:p>
     <w:p>
       <w:pPr>
-        <w:keepNext/>
-        <w:spacing w:before="280" w:after="120"/>
+        <w:spacing w:before="360" w:after="200"/>
       </w:pPr>
       <w:r>
         <w:rPr>
@@ -165,85 +106,33 @@
       </w:r>
     </w:p>
     <w:p>
-      <w:pPr>
-        <w:spacing w:after="120" w:line="276" w:lineRule="auto"/>
-      </w:pPr>
       <w:r>
-        <w:rPr>
-          <w:rFonts w:ascii="Calibri" w:hAnsi="Calibri"/>
-          <w:color w:val="334155"/>
-          <w:sz w:val="22"/>
-        </w:rPr>
-        <w:t>India leads globally in road accident fatalities, reporting over 1.5 Lakh deaths annually. These statistics represent more than tragic loss of lives; they generate massive economic consequences, accounting for an estimated ₹5.8 Lakh Crores in annual losses due to property damage, medical resources, and lost productivity. The underlying causes of this systemic failure include:</w:t>
+        <w:t>Indian transit corridors are suffering from severe structural inefficiencies, contributing to significant loss of life and financial strain. Critical pain points include:</w:t>
       </w:r>
     </w:p>
     <w:p>
-      <w:pPr>
-        <w:pStyle w:val="ListBullet"/>
-        <w:spacing w:after="80" w:line="276" w:lineRule="auto"/>
-      </w:pPr>
       <w:r>
-        <w:rPr>
-          <w:rFonts w:ascii="Calibri" w:hAnsi="Calibri"/>
-          <w:b/>
-          <w:color w:val="1E293B"/>
-          <w:sz w:val="22"/>
-        </w:rPr>
-        <w:t xml:space="preserve">Delay in Rescue Interventions: </w:t>
-      </w:r>
-      <w:r>
-        <w:rPr>
-          <w:rFonts w:ascii="Calibri" w:hAnsi="Calibri"/>
-          <w:color w:val="334155"/>
-          <w:sz w:val="22"/>
-        </w:rPr>
-        <w:t>Emergency dispatch models rely heavily on manual reporting, creating long delays in coordinates resolution during the critical 60-minute Golden Hour.</w:t>
+        <w:t>• High Annual Fatalities: Indian corridors suffer from more than 1.5 Lakhs fatalities annually, averaging 400 lives lost every single day.</w:t>
       </w:r>
     </w:p>
     <w:p>
-      <w:pPr>
-        <w:pStyle w:val="ListBullet"/>
-        <w:spacing w:after="80" w:line="276" w:lineRule="auto"/>
-      </w:pPr>
       <w:r>
-        <w:rPr>
-          <w:rFonts w:ascii="Calibri" w:hAnsi="Calibri"/>
-          <w:b/>
-          <w:color w:val="1E293B"/>
-          <w:sz w:val="22"/>
-        </w:rPr>
-        <w:t xml:space="preserve">Infrastructure Degradation and Accountability Deficit: </w:t>
-      </w:r>
-      <w:r>
-        <w:rPr>
-          <w:rFonts w:ascii="Calibri" w:hAnsi="Calibri"/>
-          <w:color w:val="334155"/>
-          <w:sz w:val="22"/>
-        </w:rPr>
-        <w:t>Potholes, signal malfunctions, and lighting hazards are frequently neglected due to uncoordinated reporting systems and zero municipal transparency regarding repair milestones and budget allocation.</w:t>
+        <w:t>• Massive Economic Loss: Road traffic accidents drain approximately ₹5.8 Lakh Crores annually, capturing almost 3% of national GDP.</w:t>
       </w:r>
     </w:p>
     <w:p>
-      <w:pPr>
-        <w:pStyle w:val="ListBullet"/>
-        <w:spacing w:after="80" w:line="276" w:lineRule="auto"/>
-      </w:pPr>
       <w:r>
-        <w:rPr>
-          <w:rFonts w:ascii="Calibri" w:hAnsi="Calibri"/>
-          <w:b/>
-          <w:color w:val="1E293B"/>
-          <w:sz w:val="22"/>
-        </w:rPr>
-        <w:t xml:space="preserve">Driver Indiscipline and Regional Ambiguity: </w:t>
+        <w:t>• Golden Hour Responding: Dispatchers struggle with delayed responses because of poor location telemetry, routing bottlenecks, and a lack of real-time coordinate locks.</w:t>
       </w:r>
+    </w:p>
+    <w:p>
       <w:r>
-        <w:rPr>
-          <w:rFonts w:ascii="Calibri" w:hAnsi="Calibri"/>
-          <w:color w:val="334155"/>
-          <w:sz w:val="22"/>
-        </w:rPr>
-        <w:t>Current legal penalty structures are static and lack real-time context. Driving habits remain unchanged due to a lack of immediate, state-calibrated legal references.</w:t>
+        <w:t>• Infrastructure Transparency: Hazard spots like severe potholes remain unlogged and unresolved due to a lack of public audit trails or visual pothole classification pipelines.</w:t>
+      </w:r>
+    </w:p>
+    <w:p>
+      <w:r>
+        <w:t>• Dynamic Surcharges: Legal violations indexes remain static, failing to adapt to dynamic municipal surcharge changes (such as the distinct fines between Tamil Nadu, Maharashtra, or Karnataka).</w:t>
       </w:r>
     </w:p>
     <w:p>
@@ -253,8 +142,7 @@
     </w:p>
     <w:p>
       <w:pPr>
-        <w:keepNext/>
-        <w:spacing w:before="280" w:after="120"/>
+        <w:spacing w:before="360" w:after="200"/>
       </w:pPr>
       <w:r>
         <w:rPr>
@@ -263,31 +151,40 @@
           <w:color w:val="0F172A"/>
           <w:sz w:val="40"/>
         </w:rPr>
-        <w:t>3. Proposed Solution: RaastaSense</w:t>
+        <w:t>3. Proposed Solution</w:t>
       </w:r>
     </w:p>
     <w:p>
-      <w:pPr>
-        <w:spacing w:after="120" w:line="276" w:lineRule="auto"/>
-      </w:pPr>
       <w:r>
-        <w:rPr>
-          <w:rFonts w:ascii="Calibri" w:hAnsi="Calibri"/>
-          <w:color w:val="334155"/>
-          <w:sz w:val="22"/>
-        </w:rPr>
-        <w:t>RaastaSense addresses these limitations with an integrated, high-fidelity command center that empowers citizens, municipalities, and emergency responders. Rather than operating as disjointed utilities, the modules form a closed-loop system where citizen watch telemetry feeds directly into municipal public works auditing, and spatial analytics automatically guides emergency corridors.</w:t>
+        <w:t>RaastaSense V2 introduces an interactive, fail-safe AI Road Safety Ecosystem. Key features include:</w:t>
       </w:r>
     </w:p>
     <w:p>
-      <w:pPr>
-        <w:spacing w:before="240" w:after="80"/>
-        <w:jc w:val="center"/>
-      </w:pPr>
+      <w:r>
+        <w:t>1. Cyberslate Live GIS HUD: Direct interactive Leaflet mapping displaying real-time speedometers, traffic-fluctuation tile layers, coordinate markers, and live telemetry simulators.</w:t>
+      </w:r>
+    </w:p>
+    <w:p>
+      <w:r>
+        <w:t>2. DriveLegal Indexer: Dynamically filters 6 core legal safety codes (overspeeding, mobile usage, helmets) with state-specific surcharge modifiers and voice synthesizers.</w:t>
+      </w:r>
+    </w:p>
+    <w:p>
+      <w:r>
+        <w:t>3. RoadWatch AI Audits: Transparent complaint logs paired with an automatic AI incident diagnostics console. Mock images submitted receive an immediate, multi-tier pixel scan (Severity Index, Risk Category, and Suggested Action Protocols).</w:t>
+      </w:r>
+    </w:p>
+    <w:p>
+      <w:r>
+        <w:t>4. RoadSOS Emergency Beacons: Sat-locked coordinates, trauma center proximity indexing, direct dial numbers, and a customized full-screen Emergency SOS alarm override panel that routes emergency dispatchers instantly.</w:t>
+      </w:r>
+    </w:p>
+    <w:p/>
+    <w:p>
       <w:r>
         <w:drawing>
           <wp:inline xmlns:a="http://schemas.openxmlformats.org/drawingml/2006/main" xmlns:pic="http://schemas.openxmlformats.org/drawingml/2006/picture">
-            <wp:extent cx="5303520" cy="5303520"/>
+            <wp:extent cx="5486400" cy="5486400"/>
             <wp:docPr id="1" name="Picture 1"/>
             <wp:cNvGraphicFramePr>
               <a:graphicFrameLocks noChangeAspect="1"/>
@@ -308,7 +205,7 @@
                   <pic:spPr>
                     <a:xfrm>
                       <a:off x="0" y="0"/>
-                      <a:ext cx="5303520" cy="5303520"/>
+                      <a:ext cx="5486400" cy="5486400"/>
                     </a:xfrm>
                     <a:prstGeom prst="rect"/>
                   </pic:spPr>
@@ -321,99 +218,15 @@
     </w:p>
     <w:p>
       <w:pPr>
-        <w:spacing w:after="240"/>
         <w:jc w:val="center"/>
       </w:pPr>
       <w:r>
         <w:rPr>
-          <w:rFonts w:ascii="Calibri" w:hAnsi="Calibri"/>
           <w:i/>
-          <w:color w:val="334155"/>
+          <w:color w:val="475569"/>
           <w:sz w:val="19"/>
         </w:rPr>
-        <w:t>Figure: RaastaSense Glassmorphic Indian Road Safety Command Dashboard</w:t>
-      </w:r>
-    </w:p>
-    <w:p>
-      <w:pPr>
-        <w:spacing w:after="120" w:line="276" w:lineRule="auto"/>
-      </w:pPr>
-      <w:r>
-        <w:rPr>
-          <w:rFonts w:ascii="Calibri" w:hAnsi="Calibri"/>
-          <w:color w:val="334155"/>
-          <w:sz w:val="22"/>
-        </w:rPr>
-        <w:t>Key Pillars of RaastaSense:</w:t>
-      </w:r>
-    </w:p>
-    <w:p>
-      <w:pPr>
-        <w:pStyle w:val="ListBullet"/>
-        <w:spacing w:after="80" w:line="276" w:lineRule="auto"/>
-      </w:pPr>
-      <w:r>
-        <w:rPr>
-          <w:rFonts w:ascii="Calibri" w:hAnsi="Calibri"/>
-          <w:b/>
-          <w:color w:val="1E293B"/>
-          <w:sz w:val="22"/>
-        </w:rPr>
-        <w:t xml:space="preserve">Real-Time Leaflet GIS Engine: </w:t>
-      </w:r>
-      <w:r>
-        <w:rPr>
-          <w:rFonts w:ascii="Calibri" w:hAnsi="Calibri"/>
-          <w:color w:val="334155"/>
-          <w:sz w:val="22"/>
-        </w:rPr>
-        <w:t>Overlays traffic density indexes (Red, Orange, Green flows) with tactical GIS markers representing potholes, police checkpoints, road construction, and hospitals.</w:t>
-      </w:r>
-    </w:p>
-    <w:p>
-      <w:pPr>
-        <w:pStyle w:val="ListBullet"/>
-        <w:spacing w:after="80" w:line="276" w:lineRule="auto"/>
-      </w:pPr>
-      <w:r>
-        <w:rPr>
-          <w:rFonts w:ascii="Calibri" w:hAnsi="Calibri"/>
-          <w:b/>
-          <w:color w:val="1E293B"/>
-          <w:sz w:val="22"/>
-        </w:rPr>
-        <w:t xml:space="preserve">Dynamic Multi-Corridor Safe Routing: </w:t>
-      </w:r>
-      <w:r>
-        <w:rPr>
-          <w:rFonts w:ascii="Calibri" w:hAnsi="Calibri"/>
-          <w:color w:val="334155"/>
-          <w:sz w:val="22"/>
-        </w:rPr>
-        <w:t>Calculates Fastest, Safest, and Least Incident routes based on historical incident risk data and road conditions.</w:t>
-      </w:r>
-    </w:p>
-    <w:p>
-      <w:pPr>
-        <w:pStyle w:val="ListBullet"/>
-        <w:spacing w:after="80" w:line="276" w:lineRule="auto"/>
-      </w:pPr>
-      <w:r>
-        <w:rPr>
-          <w:rFonts w:ascii="Calibri" w:hAnsi="Calibri"/>
-          <w:b/>
-          <w:color w:val="1E293B"/>
-          <w:sz w:val="22"/>
-        </w:rPr>
-        <w:t xml:space="preserve">Civic Accountability Audit Portal: </w:t>
-      </w:r>
-      <w:r>
-        <w:rPr>
-          <w:rFonts w:ascii="Calibri" w:hAnsi="Calibri"/>
-          <w:color w:val="334155"/>
-          <w:sz w:val="22"/>
-        </w:rPr>
-        <w:t>Provides 100% public access to municipal works budgets (Allocated vs. Spent) and chronological restoration stepper logs.</w:t>
+        <w:t>Figure 1: RaastaSense V2 Glassmorphic Cyber Intelligence Dashboard</w:t>
       </w:r>
     </w:p>
     <w:p>
@@ -423,8 +236,7 @@
     </w:p>
     <w:p>
       <w:pPr>
-        <w:keepNext/>
-        <w:spacing w:before="280" w:after="120"/>
+        <w:spacing w:before="360" w:after="200"/>
       </w:pPr>
       <w:r>
         <w:rPr>
@@ -437,70 +249,28 @@
       </w:r>
     </w:p>
     <w:p>
-      <w:pPr>
-        <w:spacing w:after="120" w:line="276" w:lineRule="auto"/>
-      </w:pPr>
       <w:r>
-        <w:rPr>
-          <w:rFonts w:ascii="Calibri" w:hAnsi="Calibri"/>
-          <w:color w:val="334155"/>
-          <w:sz w:val="22"/>
-        </w:rPr>
-        <w:t>The architecture is designed to optimize data ingestion, maintain deterministic reliability, and deliver clean, real-time spatial rendering. The platform uses a decoupled frontend-backend model built for offline-first resilience:</w:t>
+        <w:t>The RaastaSense platform utilizes a highly scalable, decoupled client-server architecture. The components include:</w:t>
       </w:r>
     </w:p>
     <w:p>
-      <w:pPr>
-        <w:spacing w:after="120" w:line="276" w:lineRule="auto"/>
-      </w:pPr>
       <w:r>
-        <w:rPr>
-          <w:rFonts w:ascii="Calibri" w:hAnsi="Calibri"/>
-          <w:b/>
-          <w:color w:val="1E293B"/>
-          <w:sz w:val="22"/>
-        </w:rPr>
-        <w:t>Data Pipeline Flow:</w:t>
-        <w:br/>
-      </w:r>
-      <w:r>
-        <w:rPr>
-          <w:rFonts w:ascii="Calibri" w:hAnsi="Calibri"/>
-          <w:color w:val="334155"/>
-          <w:sz w:val="22"/>
-        </w:rPr>
-        <w:t>[DATA LAYER] Geolocation Telemetry / State Surcharges / Budgets</w:t>
-        <w:br/>
-        <w:t xml:space="preserve">        │</w:t>
-        <w:br/>
-        <w:t xml:space="preserve">        ▼</w:t>
-        <w:br/>
-        <w:t>[API BACKEND] Node.js &amp; Express / Static Safety Fallback Database</w:t>
-        <w:br/>
-        <w:t xml:space="preserve">        │</w:t>
-        <w:br/>
-        <w:t xml:space="preserve">        ▼</w:t>
-        <w:br/>
-        <w:t>[FRONTEND CORE] React 18 / Redux State / Framer Motion</w:t>
-        <w:br/>
-        <w:t xml:space="preserve">        │</w:t>
-        <w:br/>
-        <w:t xml:space="preserve">        ▼</w:t>
-        <w:br/>
-        <w:t>[GIS VISUALS] Leaflet GIS Container / OpenStreetMap Tile Overlays</w:t>
+        <w:t>• Client Tier: React 18, Vite, Framer Motion, custom vector SVGs, and Tailwind CSS.</w:t>
       </w:r>
     </w:p>
     <w:p>
-      <w:pPr>
-        <w:spacing w:after="120" w:line="276" w:lineRule="auto"/>
-      </w:pPr>
       <w:r>
-        <w:rPr>
-          <w:rFonts w:ascii="Calibri" w:hAnsi="Calibri"/>
-          <w:color w:val="334155"/>
-          <w:sz w:val="22"/>
-        </w:rPr>
-        <w:t>This decoupled architecture ensures that if the Generative AI engine is disconnected or lacks API keys, the system self-heals by instantly falling back to localized safety guidelines, municipal budget assets, and pre-calculated safety corridors. This ensures high availability and presentation resilience.</w:t>
+        <w:t>• Map Layer: OpenStreetMap integrations, polyline coordinates generator, and dynamic marker overlays.</w:t>
+      </w:r>
+    </w:p>
+    <w:p>
+      <w:r>
+        <w:t>• Backend &amp; API: Express server, telemetry polling, and NoSQL Firestore mock logs.</w:t>
+      </w:r>
+    </w:p>
+    <w:p>
+      <w:r>
+        <w:t>• AI Diagnostics: Pothole pixel classification model using Google Generative AI (Gemini) fallback channels.</w:t>
       </w:r>
     </w:p>
     <w:p>
@@ -510,8 +280,7 @@
     </w:p>
     <w:p>
       <w:pPr>
-        <w:keepNext/>
-        <w:spacing w:before="280" w:after="120"/>
+        <w:spacing w:before="360" w:after="200"/>
       </w:pPr>
       <w:r>
         <w:rPr>
@@ -525,110 +294,28 @@
     </w:p>
     <w:p>
       <w:pPr>
-        <w:keepNext/>
-        <w:spacing w:before="280" w:after="120"/>
+        <w:spacing w:before="240" w:after="120"/>
       </w:pPr>
       <w:r>
         <w:rPr>
           <w:rFonts w:ascii="Century Gothic" w:hAnsi="Century Gothic"/>
           <w:b/>
-          <w:color w:val="38BDF8"/>
+          <w:color w:val="475569"/>
           <w:sz w:val="28"/>
         </w:rPr>
-        <w:t>5.1 Safe Route Engine</w:t>
+        <w:t>5.1 Safe Route Engine (Phase 8 Highlight)</w:t>
       </w:r>
     </w:p>
     <w:p>
-      <w:pPr>
-        <w:spacing w:after="120" w:line="276" w:lineRule="auto"/>
-      </w:pPr>
       <w:r>
-        <w:rPr>
-          <w:rFonts w:ascii="Calibri" w:hAnsi="Calibri"/>
-          <w:color w:val="334155"/>
-          <w:sz w:val="22"/>
-        </w:rPr>
-        <w:t>The routing core departs from standard distance-based engines by calculating safety parameters. When a source and destination are inputted, the engine maps three distinct options:</w:t>
+        <w:t>The dynamic navigation module generates three distinct routing corridors (Fastest, Safest, and Least Incident path). It visualizes safety percentages, traffic congestion indexes, accident probability ratios, and rain/weather impact states, applying distinct highlights to emphasize the absolute safest route for two-wheeler or four-wheeler safety.</w:t>
       </w:r>
     </w:p>
     <w:p>
-      <w:pPr>
-        <w:pStyle w:val="ListBullet"/>
-        <w:spacing w:after="80" w:line="276" w:lineRule="auto"/>
-      </w:pPr>
-      <w:r>
-        <w:rPr>
-          <w:rFonts w:ascii="Calibri" w:hAnsi="Calibri"/>
-          <w:b/>
-          <w:color w:val="1E293B"/>
-          <w:sz w:val="22"/>
-        </w:rPr>
-        <w:t xml:space="preserve">Route A (Fastest Corridor): </w:t>
-      </w:r>
-      <w:r>
-        <w:rPr>
-          <w:rFonts w:ascii="Calibri" w:hAnsi="Calibri"/>
-          <w:color w:val="334155"/>
-          <w:sz w:val="22"/>
-        </w:rPr>
-        <w:t>Optimized for absolute travel speed, utilizing direct roadways with green flowing traffic density polylines.</w:t>
-      </w:r>
-    </w:p>
-    <w:p>
-      <w:pPr>
-        <w:pStyle w:val="ListBullet"/>
-        <w:spacing w:after="80" w:line="276" w:lineRule="auto"/>
-      </w:pPr>
-      <w:r>
-        <w:rPr>
-          <w:rFonts w:ascii="Calibri" w:hAnsi="Calibri"/>
-          <w:b/>
-          <w:color w:val="1E293B"/>
-          <w:sz w:val="22"/>
-        </w:rPr>
-        <w:t xml:space="preserve">Route B (Safest Corridor): </w:t>
-      </w:r>
-      <w:r>
-        <w:rPr>
-          <w:rFonts w:ascii="Calibri" w:hAnsi="Calibri"/>
-          <w:color w:val="334155"/>
-          <w:sz w:val="22"/>
-        </w:rPr>
-        <w:t>Prioritizes minimal risk exposure, avoiding high-accident zones, heavy rain caution sectors, and active pothole zones.</w:t>
-      </w:r>
-    </w:p>
-    <w:p>
-      <w:pPr>
-        <w:pStyle w:val="ListBullet"/>
-        <w:spacing w:after="80" w:line="276" w:lineRule="auto"/>
-      </w:pPr>
-      <w:r>
-        <w:rPr>
-          <w:rFonts w:ascii="Calibri" w:hAnsi="Calibri"/>
-          <w:b/>
-          <w:color w:val="1E293B"/>
-          <w:sz w:val="22"/>
-        </w:rPr>
-        <w:t xml:space="preserve">Route C (Least Incident Corridor): </w:t>
-      </w:r>
-      <w:r>
-        <w:rPr>
-          <w:rFonts w:ascii="Calibri" w:hAnsi="Calibri"/>
-          <w:color w:val="334155"/>
-          <w:sz w:val="22"/>
-        </w:rPr>
-        <w:t>Bypasses active road closures and signal failures based on real-time municipal telemetry indices.</w:t>
-      </w:r>
-    </w:p>
-    <w:p>
-      <w:pPr>
-        <w:spacing w:before="240" w:after="80"/>
-        <w:jc w:val="center"/>
-      </w:pPr>
       <w:r>
         <w:drawing>
           <wp:inline xmlns:a="http://schemas.openxmlformats.org/drawingml/2006/main" xmlns:pic="http://schemas.openxmlformats.org/drawingml/2006/picture">
-            <wp:extent cx="5303520" cy="5303520"/>
+            <wp:extent cx="5486400" cy="5486400"/>
             <wp:docPr id="2" name="Picture 2"/>
             <wp:cNvGraphicFramePr>
               <a:graphicFrameLocks noChangeAspect="1"/>
@@ -649,7 +336,7 @@
                   <pic:spPr>
                     <a:xfrm>
                       <a:off x="0" y="0"/>
-                      <a:ext cx="5303520" cy="5303520"/>
+                      <a:ext cx="5486400" cy="5486400"/>
                     </a:xfrm>
                     <a:prstGeom prst="rect"/>
                   </pic:spPr>
@@ -662,301 +349,79 @@
     </w:p>
     <w:p>
       <w:pPr>
-        <w:spacing w:after="240"/>
         <w:jc w:val="center"/>
       </w:pPr>
       <w:r>
         <w:rPr>
-          <w:rFonts w:ascii="Calibri" w:hAnsi="Calibri"/>
           <w:i/>
-          <w:color w:val="334155"/>
+          <w:color w:val="475569"/>
           <w:sz w:val="19"/>
         </w:rPr>
-        <w:t>Figure: RaastaSense Dynamic Safe Route Corridor Navigation HUD</w:t>
+        <w:t>Figure 2: Safe Route Corridor Navigation HUD &amp; Deep Safety Metrics</w:t>
       </w:r>
     </w:p>
     <w:p>
       <w:pPr>
-        <w:keepNext/>
-        <w:spacing w:before="280" w:after="120"/>
+        <w:spacing w:before="240" w:after="120"/>
       </w:pPr>
       <w:r>
         <w:rPr>
           <w:rFonts w:ascii="Century Gothic" w:hAnsi="Century Gothic"/>
           <w:b/>
-          <w:color w:val="38BDF8"/>
+          <w:color w:val="475569"/>
           <w:sz w:val="28"/>
         </w:rPr>
         <w:t>5.2 DriveLegal Index</w:t>
       </w:r>
     </w:p>
     <w:p>
-      <w:pPr>
-        <w:spacing w:after="120" w:line="276" w:lineRule="auto"/>
-      </w:pPr>
       <w:r>
-        <w:rPr>
-          <w:rFonts w:ascii="Calibri" w:hAnsi="Calibri"/>
-          <w:color w:val="334155"/>
-          <w:sz w:val="22"/>
-        </w:rPr>
-        <w:t>DriveLegal is a comprehensive safety rules directory mapping 6 critical categories (Helmet, Seatbelt, Signal Jump, Drunk Driving, Overspeeding, Mobile Usage). It includes a location-specific regional surcharge selector:</w:t>
+        <w:t>Fosters citizen awareness by displaying detailed explanations of violations. Standard fines scale dynamically based on selected Indian state rules (e.g. 20% fine surcharge in Tamil Nadu, 30% in Maharashtra) to simulate local transport department parameters.</w:t>
       </w:r>
     </w:p>
     <w:p>
       <w:pPr>
-        <w:pStyle w:val="ListBullet"/>
-        <w:spacing w:after="80" w:line="276" w:lineRule="auto"/>
-      </w:pPr>
-      <w:r>
-        <w:rPr>
-          <w:rFonts w:ascii="Calibri" w:hAnsi="Calibri"/>
-          <w:b/>
-          <w:color w:val="1E293B"/>
-          <w:sz w:val="22"/>
-        </w:rPr>
-        <w:t xml:space="preserve">Karnataka (Standard Rates): </w:t>
-      </w:r>
-      <w:r>
-        <w:rPr>
-          <w:rFonts w:ascii="Calibri" w:hAnsi="Calibri"/>
-          <w:color w:val="334155"/>
-          <w:sz w:val="22"/>
-        </w:rPr>
-        <w:t>Renders baseline national motor vehicle penalty indexes.</w:t>
-      </w:r>
-    </w:p>
-    <w:p>
-      <w:pPr>
-        <w:pStyle w:val="ListBullet"/>
-        <w:spacing w:after="80" w:line="276" w:lineRule="auto"/>
-      </w:pPr>
-      <w:r>
-        <w:rPr>
-          <w:rFonts w:ascii="Calibri" w:hAnsi="Calibri"/>
-          <w:b/>
-          <w:color w:val="1E293B"/>
-          <w:sz w:val="22"/>
-        </w:rPr>
-        <w:t xml:space="preserve">Tamil Nadu (+20% Surcharge): </w:t>
-      </w:r>
-      <w:r>
-        <w:rPr>
-          <w:rFonts w:ascii="Calibri" w:hAnsi="Calibri"/>
-          <w:color w:val="334155"/>
-          <w:sz w:val="22"/>
-        </w:rPr>
-        <w:t>Applies a 20% surcharge based on regional metropolitan congestion codes.</w:t>
-      </w:r>
-    </w:p>
-    <w:p>
-      <w:pPr>
-        <w:pStyle w:val="ListBullet"/>
-        <w:spacing w:after="80" w:line="276" w:lineRule="auto"/>
-      </w:pPr>
-      <w:r>
-        <w:rPr>
-          <w:rFonts w:ascii="Calibri" w:hAnsi="Calibri"/>
-          <w:b/>
-          <w:color w:val="1E293B"/>
-          <w:sz w:val="22"/>
-        </w:rPr>
-        <w:t xml:space="preserve">Maharashtra (+30% Surcharge): </w:t>
-      </w:r>
-      <w:r>
-        <w:rPr>
-          <w:rFonts w:ascii="Calibri" w:hAnsi="Calibri"/>
-          <w:color w:val="334155"/>
-          <w:sz w:val="22"/>
-        </w:rPr>
-        <w:t>Applies a 30% premium based on industrial safety frameworks.</w:t>
-      </w:r>
-    </w:p>
-    <w:p>
-      <w:pPr>
-        <w:keepNext/>
-        <w:spacing w:before="280" w:after="120"/>
+        <w:spacing w:before="240" w:after="120"/>
       </w:pPr>
       <w:r>
         <w:rPr>
           <w:rFonts w:ascii="Century Gothic" w:hAnsi="Century Gothic"/>
           <w:b/>
-          <w:color w:val="38BDF8"/>
+          <w:color w:val="475569"/>
           <w:sz w:val="28"/>
         </w:rPr>
-        <w:t>5.3 RoadWatch Transparency Hub</w:t>
+        <w:t>5.3 RoadWatch Incident Diagnostics</w:t>
+      </w:r>
+    </w:p>
+    <w:p>
+      <w:r>
+        <w:t>Allows citizens to upload image reports. An automated, simulated AI pixel diagnostics console executes a multi-layer evaluation indexing severity out of 10, confidence rates, hazard categorization, and direct action guidelines (e.g. Immediate Asphalt Patching).</w:t>
       </w:r>
     </w:p>
     <w:p>
       <w:pPr>
-        <w:spacing w:after="120" w:line="276" w:lineRule="auto"/>
-      </w:pPr>
-      <w:r>
-        <w:rPr>
-          <w:rFonts w:ascii="Calibri" w:hAnsi="Calibri"/>
-          <w:color w:val="334155"/>
-          <w:sz w:val="22"/>
-        </w:rPr>
-        <w:t>A dual-mode watch dashboard designed to drive transparency. The module is split into:</w:t>
-      </w:r>
-    </w:p>
-    <w:p>
-      <w:pPr>
-        <w:pStyle w:val="ListBullet"/>
-        <w:spacing w:after="80" w:line="276" w:lineRule="auto"/>
-      </w:pPr>
-      <w:r>
-        <w:rPr>
-          <w:rFonts w:ascii="Calibri" w:hAnsi="Calibri"/>
-          <w:b/>
-          <w:color w:val="1E293B"/>
-          <w:sz w:val="22"/>
-        </w:rPr>
-        <w:t xml:space="preserve">1. Citizen Watch Incident Filing: </w:t>
-      </w:r>
-      <w:r>
-        <w:rPr>
-          <w:rFonts w:ascii="Calibri" w:hAnsi="Calibri"/>
-          <w:color w:val="334155"/>
-          <w:sz w:val="22"/>
-        </w:rPr>
-        <w:t>Allows citizens to mock upload incident pictures and select GPS coordinates.</w:t>
-      </w:r>
-    </w:p>
-    <w:p>
-      <w:pPr>
-        <w:pStyle w:val="ListBullet"/>
-        <w:spacing w:after="80" w:line="276" w:lineRule="auto"/>
-      </w:pPr>
-      <w:r>
-        <w:rPr>
-          <w:rFonts w:ascii="Calibri" w:hAnsi="Calibri"/>
-          <w:b/>
-          <w:color w:val="1E293B"/>
-          <w:sz w:val="22"/>
-        </w:rPr>
-        <w:t xml:space="preserve">2. Public Works Transparency Audit: </w:t>
-      </w:r>
-      <w:r>
-        <w:rPr>
-          <w:rFonts w:ascii="Calibri" w:hAnsi="Calibri"/>
-          <w:color w:val="334155"/>
-          <w:sz w:val="22"/>
-        </w:rPr>
-        <w:t>Displays active municipal repairs, tracking Allocated vs Spent budgets and maintenance stepper milestones.</w:t>
-      </w:r>
-    </w:p>
-    <w:p>
-      <w:pPr>
-        <w:keepNext/>
-        <w:spacing w:before="280" w:after="120"/>
+        <w:spacing w:before="240" w:after="120"/>
       </w:pPr>
       <w:r>
         <w:rPr>
           <w:rFonts w:ascii="Century Gothic" w:hAnsi="Century Gothic"/>
           <w:b/>
-          <w:color w:val="38BDF8"/>
+          <w:color w:val="475569"/>
           <w:sz w:val="28"/>
         </w:rPr>
-        <w:t>5.4 RoadSOS Control Beacon</w:t>
+        <w:t>5.4 RoadSOS Emergency Controller</w:t>
       </w:r>
     </w:p>
     <w:p>
-      <w:pPr>
-        <w:spacing w:after="120" w:line="276" w:lineRule="auto"/>
-      </w:pPr>
       <w:r>
-        <w:rPr>
-          <w:rFonts w:ascii="Calibri" w:hAnsi="Calibri"/>
-          <w:color w:val="334155"/>
-          <w:sz w:val="22"/>
-        </w:rPr>
-        <w:t>The safety net of the platform. Activating the beacon initiates a descending 60-minute countdown timer designed to coordinate rescue teams, locking exact GPS telemetry coordinates and pre-routing dispatch teams to the nearest response centers.</w:t>
+        <w:t>Emergency coordinate resolve logs direct sat-locks. Shows responder proximities (Hospitals &amp; Police centers) with one-click dial anchors, and triggers a beautiful full-screen overlay panel showing evacuation escape routes and immediate dispatcher twilio broadcasts.</w:t>
       </w:r>
     </w:p>
     <w:p>
-      <w:pPr>
-        <w:keepNext/>
-        <w:spacing w:before="280" w:after="120"/>
-      </w:pPr>
-      <w:r>
-        <w:rPr>
-          <w:rFonts w:ascii="Century Gothic" w:hAnsi="Century Gothic"/>
-          <w:b/>
-          <w:color w:val="38BDF8"/>
-          <w:sz w:val="28"/>
-        </w:rPr>
-        <w:t>5.5 Multilingual i18n &amp; Observability HUD</w:t>
-      </w:r>
-    </w:p>
-    <w:p>
-      <w:pPr>
-        <w:spacing w:after="120" w:line="276" w:lineRule="auto"/>
-      </w:pPr>
-      <w:r>
-        <w:rPr>
-          <w:rFonts w:ascii="Calibri" w:hAnsi="Calibri"/>
-          <w:color w:val="334155"/>
-          <w:sz w:val="22"/>
-        </w:rPr>
-        <w:t>To deliver a finalist-tier user experience and maximize IIT Madras evaluation metrics, RaastaSense integrates two core architectural systems:</w:t>
-      </w:r>
-    </w:p>
-    <w:p>
-      <w:pPr>
-        <w:pStyle w:val="ListBullet"/>
-        <w:spacing w:after="80" w:line="276" w:lineRule="auto"/>
-      </w:pPr>
-      <w:r>
-        <w:rPr>
-          <w:rFonts w:ascii="Calibri" w:hAnsi="Calibri"/>
-          <w:b/>
-          <w:color w:val="1E293B"/>
-          <w:sz w:val="22"/>
-        </w:rPr>
-        <w:t xml:space="preserve">1. 9-Language Localization Dropdown: </w:t>
-      </w:r>
-      <w:r>
-        <w:rPr>
-          <w:rFonts w:ascii="Calibri" w:hAnsi="Calibri"/>
-          <w:color w:val="334155"/>
-          <w:sz w:val="22"/>
-        </w:rPr>
-        <w:t>Provides complete internationalization (i18n) across 9 native languages: English, Hindi, Marathi, Tamil, Telugu, Kannada, Gujarati, Punjabi, and Bengali. Powered by standard React states and a custom localized dictionary asset, users can instantly translate all dashboard metrics and Counselor advisors with zero runtime overhead or external network dependencies.</w:t>
-      </w:r>
-    </w:p>
-    <w:p>
-      <w:pPr>
-        <w:pStyle w:val="ListBullet"/>
-        <w:spacing w:after="80" w:line="276" w:lineRule="auto"/>
-      </w:pPr>
-      <w:r>
-        <w:rPr>
-          <w:rFonts w:ascii="Calibri" w:hAnsi="Calibri"/>
-          <w:b/>
-          <w:color w:val="1E293B"/>
-          <w:sz w:val="22"/>
-        </w:rPr>
-        <w:t xml:space="preserve">2. Safety Analytics &amp; Observability Settings: </w:t>
-      </w:r>
-      <w:r>
-        <w:rPr>
-          <w:rFonts w:ascii="Calibri" w:hAnsi="Calibri"/>
-          <w:color w:val="334155"/>
-          <w:sz w:val="22"/>
-        </w:rPr>
-        <w:t>Presents dynamic inline SVG-rendered line charts tracking daily route alert volumes, congested corridor trends, and public works ticket resolution times, combined with mock Firestore NoSQL telemetry streams and an infrastructure logging feed.</w:t>
-      </w:r>
-    </w:p>
-    <w:p>
-      <w:pPr>
-        <w:spacing w:before="240" w:after="80"/>
-        <w:jc w:val="center"/>
-      </w:pPr>
       <w:r>
         <w:drawing>
           <wp:inline xmlns:a="http://schemas.openxmlformats.org/drawingml/2006/main" xmlns:pic="http://schemas.openxmlformats.org/drawingml/2006/picture">
-            <wp:extent cx="5303520" cy="5303520"/>
+            <wp:extent cx="5486400" cy="5486400"/>
             <wp:docPr id="3" name="Picture 3"/>
             <wp:cNvGraphicFramePr>
               <a:graphicFrameLocks noChangeAspect="1"/>
@@ -977,7 +442,7 @@
                   <pic:spPr>
                     <a:xfrm>
                       <a:off x="0" y="0"/>
-                      <a:ext cx="5303520" cy="5303520"/>
+                      <a:ext cx="5486400" cy="5486400"/>
                     </a:xfrm>
                     <a:prstGeom prst="rect"/>
                   </pic:spPr>
@@ -990,17 +455,15 @@
     </w:p>
     <w:p>
       <w:pPr>
-        <w:spacing w:after="240"/>
         <w:jc w:val="center"/>
       </w:pPr>
       <w:r>
         <w:rPr>
-          <w:rFonts w:ascii="Calibri" w:hAnsi="Calibri"/>
           <w:i/>
-          <w:color w:val="334155"/>
+          <w:color w:val="475569"/>
           <w:sz w:val="19"/>
         </w:rPr>
-        <w:t>Figure: RaastaSense System Settings Observability &amp; Live Telemetry Diagnostics Console</w:t>
+        <w:t>Figure 3: System HUD, Multilingual Localization and Live Cloud Telemetry Console</w:t>
       </w:r>
     </w:p>
     <w:p>
@@ -1010,8 +473,7 @@
     </w:p>
     <w:p>
       <w:pPr>
-        <w:keepNext/>
-        <w:spacing w:before="280" w:after="120"/>
+        <w:spacing w:before="360" w:after="200"/>
       </w:pPr>
       <w:r>
         <w:rPr>
@@ -1020,220 +482,19 @@
           <w:color w:val="0F172A"/>
           <w:sz w:val="40"/>
         </w:rPr>
-        <w:t>6. Technology Stack &amp; Dependencies</w:t>
+        <w:t>6. Technology Stack &amp; Software Packages</w:t>
       </w:r>
     </w:p>
     <w:p>
-      <w:pPr>
-        <w:keepNext/>
-        <w:spacing w:before="280" w:after="120"/>
-      </w:pPr>
       <w:r>
-        <w:rPr>
-          <w:rFonts w:ascii="Century Gothic" w:hAnsi="Century Gothic"/>
-          <w:b/>
-          <w:color w:val="38BDF8"/>
-          <w:sz w:val="28"/>
-        </w:rPr>
-        <w:t>6.1 Core Frontend Stack</w:t>
-      </w:r>
-    </w:p>
-    <w:p>
-      <w:pPr>
-        <w:pStyle w:val="ListBullet"/>
-        <w:spacing w:after="80" w:line="276" w:lineRule="auto"/>
-      </w:pPr>
-      <w:r>
-        <w:rPr>
-          <w:rFonts w:ascii="Calibri" w:hAnsi="Calibri"/>
-          <w:b/>
-          <w:color w:val="1E293B"/>
-          <w:sz w:val="22"/>
-        </w:rPr>
-        <w:t xml:space="preserve">UI framework: </w:t>
-      </w:r>
-      <w:r>
-        <w:rPr>
-          <w:rFonts w:ascii="Calibri" w:hAnsi="Calibri"/>
-          <w:color w:val="334155"/>
-          <w:sz w:val="22"/>
-        </w:rPr>
-        <w:t>React 18 (TypeScript) - Direct UI engine</w:t>
-      </w:r>
-    </w:p>
-    <w:p>
-      <w:pPr>
-        <w:pStyle w:val="ListBullet"/>
-        <w:spacing w:after="80" w:line="276" w:lineRule="auto"/>
-      </w:pPr>
-      <w:r>
-        <w:rPr>
-          <w:rFonts w:ascii="Calibri" w:hAnsi="Calibri"/>
-          <w:b/>
-          <w:color w:val="1E293B"/>
-          <w:sz w:val="22"/>
-        </w:rPr>
-        <w:t xml:space="preserve">Styling: </w:t>
-      </w:r>
-      <w:r>
-        <w:rPr>
-          <w:rFonts w:ascii="Calibri" w:hAnsi="Calibri"/>
-          <w:color w:val="334155"/>
-          <w:sz w:val="22"/>
-        </w:rPr>
-        <w:t>Tailwind CSS - Premium responsive styling &amp; design tokens</w:t>
-      </w:r>
-    </w:p>
-    <w:p>
-      <w:pPr>
-        <w:pStyle w:val="ListBullet"/>
-        <w:spacing w:after="80" w:line="276" w:lineRule="auto"/>
-      </w:pPr>
-      <w:r>
-        <w:rPr>
-          <w:rFonts w:ascii="Calibri" w:hAnsi="Calibri"/>
-          <w:b/>
-          <w:color w:val="1E293B"/>
-          <w:sz w:val="22"/>
-        </w:rPr>
-        <w:t xml:space="preserve">Mapping: </w:t>
-      </w:r>
-      <w:r>
-        <w:rPr>
-          <w:rFonts w:ascii="Calibri" w:hAnsi="Calibri"/>
-          <w:color w:val="334155"/>
-          <w:sz w:val="22"/>
-        </w:rPr>
-        <w:t>Leaflet.js - Full interactive map canvas rendering</w:t>
-      </w:r>
-    </w:p>
-    <w:p>
-      <w:pPr>
-        <w:pStyle w:val="ListBullet"/>
-        <w:spacing w:after="80" w:line="276" w:lineRule="auto"/>
-      </w:pPr>
-      <w:r>
-        <w:rPr>
-          <w:rFonts w:ascii="Calibri" w:hAnsi="Calibri"/>
-          <w:b/>
-          <w:color w:val="1E293B"/>
-          <w:sz w:val="22"/>
-        </w:rPr>
-        <w:t xml:space="preserve">Animations: </w:t>
-      </w:r>
-      <w:r>
-        <w:rPr>
-          <w:rFonts w:ascii="Calibri" w:hAnsi="Calibri"/>
-          <w:color w:val="334155"/>
-          <w:sz w:val="22"/>
-        </w:rPr>
-        <w:t>Framer Motion - Smooth glassmorphic transitions and animated traffic polylines</w:t>
-      </w:r>
-    </w:p>
-    <w:p>
-      <w:pPr>
-        <w:keepNext/>
-        <w:spacing w:before="280" w:after="120"/>
-      </w:pPr>
-      <w:r>
-        <w:rPr>
-          <w:rFonts w:ascii="Century Gothic" w:hAnsi="Century Gothic"/>
-          <w:b/>
-          <w:color w:val="38BDF8"/>
-          <w:sz w:val="28"/>
-        </w:rPr>
-        <w:t>6.2 API Catalog</w:t>
-      </w:r>
-    </w:p>
-    <w:p>
-      <w:pPr>
-        <w:pStyle w:val="ListBullet"/>
-        <w:spacing w:after="80" w:line="276" w:lineRule="auto"/>
-      </w:pPr>
-      <w:r>
-        <w:rPr>
-          <w:rFonts w:ascii="Calibri" w:hAnsi="Calibri"/>
-          <w:b/>
-          <w:color w:val="1E293B"/>
-          <w:sz w:val="22"/>
-        </w:rPr>
-        <w:t xml:space="preserve">Tiles: </w:t>
-      </w:r>
-      <w:r>
-        <w:rPr>
-          <w:rFonts w:ascii="Calibri" w:hAnsi="Calibri"/>
-          <w:color w:val="334155"/>
-          <w:sz w:val="22"/>
-        </w:rPr>
-        <w:t>OpenStreetMap WMS API - Dynamic geospatial tile layers</w:t>
-      </w:r>
-    </w:p>
-    <w:p>
-      <w:pPr>
-        <w:pStyle w:val="ListBullet"/>
-        <w:spacing w:after="80" w:line="276" w:lineRule="auto"/>
-      </w:pPr>
-      <w:r>
-        <w:rPr>
-          <w:rFonts w:ascii="Calibri" w:hAnsi="Calibri"/>
-          <w:b/>
-          <w:color w:val="1E293B"/>
-          <w:sz w:val="22"/>
-        </w:rPr>
-        <w:t xml:space="preserve">AI Advisor: </w:t>
-      </w:r>
-      <w:r>
-        <w:rPr>
-          <w:rFonts w:ascii="Calibri" w:hAnsi="Calibri"/>
-          <w:color w:val="334155"/>
-          <w:sz w:val="22"/>
-        </w:rPr>
-        <w:t>Google Generative AI (Gemini API) - Driving legal counselor chatbot integration</w:t>
-      </w:r>
-    </w:p>
-    <w:p>
-      <w:pPr>
-        <w:pStyle w:val="ListBullet"/>
-        <w:spacing w:after="80" w:line="276" w:lineRule="auto"/>
-      </w:pPr>
-      <w:r>
-        <w:rPr>
-          <w:rFonts w:ascii="Calibri" w:hAnsi="Calibri"/>
-          <w:b/>
-          <w:color w:val="1E293B"/>
-          <w:sz w:val="22"/>
-        </w:rPr>
-        <w:t xml:space="preserve">GPS Tracking: </w:t>
-      </w:r>
-      <w:r>
-        <w:rPr>
-          <w:rFonts w:ascii="Calibri" w:hAnsi="Calibri"/>
-          <w:color w:val="334155"/>
-          <w:sz w:val="22"/>
-        </w:rPr>
-        <w:t>HTML5 Geolocation API - Coordinate resolution for emergency dispatching</w:t>
-      </w:r>
-    </w:p>
-    <w:p>
-      <w:pPr>
-        <w:keepNext/>
-        <w:spacing w:before="280" w:after="120"/>
-      </w:pPr>
-      <w:r>
-        <w:rPr>
-          <w:rFonts w:ascii="Century Gothic" w:hAnsi="Century Gothic"/>
-          <w:b/>
-          <w:color w:val="38BDF8"/>
-          <w:sz w:val="28"/>
-        </w:rPr>
-        <w:t>6.3 Software Packages Used</w:t>
+        <w:t>Below is a tabulated summary of the technologies and core packages deployed within RaastaSense V2:</w:t>
       </w:r>
     </w:p>
     <w:tbl>
       <w:tblPr>
-        <w:tblStyle w:val="LightShading-Accent1"/>
         <w:tblW w:type="auto" w:w="0"/>
         <w:jc w:val="center"/>
+        <w:tblLayout w:type="fixed"/>
         <w:tblLook w:firstColumn="1" w:firstRow="1" w:lastColumn="0" w:lastRow="0" w:noHBand="0" w:noVBand="1" w:val="04A0"/>
       </w:tblPr>
       <w:tblGrid>
@@ -1245,30 +506,63 @@
         <w:tc>
           <w:tcPr>
             <w:tcW w:type="dxa" w:w="3120"/>
+            <w:shd w:fill="0F172A"/>
+            <w:tcMar>
+              <w:top w:w="100" w:type="dxa"/>
+              <w:bottom w:w="100" w:type="dxa"/>
+              <w:left w:w="150" w:type="dxa"/>
+              <w:right w:w="150" w:type="dxa"/>
+            </w:tcMar>
           </w:tcPr>
           <w:p>
             <w:r>
-              <w:t>Package Name</w:t>
+              <w:rPr>
+                <w:b/>
+                <w:color w:val="FFFFFF"/>
+              </w:rPr>
+              <w:t>Component</w:t>
             </w:r>
           </w:p>
         </w:tc>
         <w:tc>
           <w:tcPr>
             <w:tcW w:type="dxa" w:w="3120"/>
+            <w:shd w:fill="0F172A"/>
+            <w:tcMar>
+              <w:top w:w="100" w:type="dxa"/>
+              <w:bottom w:w="100" w:type="dxa"/>
+              <w:left w:w="150" w:type="dxa"/>
+              <w:right w:w="150" w:type="dxa"/>
+            </w:tcMar>
           </w:tcPr>
           <w:p>
             <w:r>
-              <w:t>Version</w:t>
+              <w:rPr>
+                <w:b/>
+                <w:color w:val="FFFFFF"/>
+              </w:rPr>
+              <w:t>Technologies / Libraries</w:t>
             </w:r>
           </w:p>
         </w:tc>
         <w:tc>
           <w:tcPr>
             <w:tcW w:type="dxa" w:w="3120"/>
+            <w:shd w:fill="0F172A"/>
+            <w:tcMar>
+              <w:top w:w="100" w:type="dxa"/>
+              <w:bottom w:w="100" w:type="dxa"/>
+              <w:left w:w="150" w:type="dxa"/>
+              <w:right w:w="150" w:type="dxa"/>
+            </w:tcMar>
           </w:tcPr>
           <w:p>
             <w:r>
-              <w:t>Primary Purpose</w:t>
+              <w:rPr>
+                <w:b/>
+                <w:color w:val="FFFFFF"/>
+              </w:rPr>
+              <w:t>Purpose</w:t>
             </w:r>
           </w:p>
         </w:tc>
@@ -1277,30 +571,51 @@
         <w:tc>
           <w:tcPr>
             <w:tcW w:type="dxa" w:w="3120"/>
+            <w:tcMar>
+              <w:top w:w="100" w:type="dxa"/>
+              <w:bottom w:w="100" w:type="dxa"/>
+              <w:left w:w="150" w:type="dxa"/>
+              <w:right w:w="150" w:type="dxa"/>
+            </w:tcMar>
+            <w:shd w:fill="FFFFFF"/>
           </w:tcPr>
           <w:p>
             <w:r>
-              <w:t>vite</w:t>
+              <w:t>Frontend UI</w:t>
             </w:r>
           </w:p>
         </w:tc>
         <w:tc>
           <w:tcPr>
             <w:tcW w:type="dxa" w:w="3120"/>
+            <w:tcMar>
+              <w:top w:w="100" w:type="dxa"/>
+              <w:bottom w:w="100" w:type="dxa"/>
+              <w:left w:w="150" w:type="dxa"/>
+              <w:right w:w="150" w:type="dxa"/>
+            </w:tcMar>
+            <w:shd w:fill="FFFFFF"/>
           </w:tcPr>
           <w:p>
             <w:r>
-              <w:t>^5.4.11</w:t>
+              <w:t>React 18, Vite, Tailwind CSS</w:t>
             </w:r>
           </w:p>
         </w:tc>
         <w:tc>
           <w:tcPr>
             <w:tcW w:type="dxa" w:w="3120"/>
+            <w:tcMar>
+              <w:top w:w="100" w:type="dxa"/>
+              <w:bottom w:w="100" w:type="dxa"/>
+              <w:left w:w="150" w:type="dxa"/>
+              <w:right w:w="150" w:type="dxa"/>
+            </w:tcMar>
+            <w:shd w:fill="FFFFFF"/>
           </w:tcPr>
           <w:p>
             <w:r>
-              <w:t>Next-gen React bundler</w:t>
+              <w:t>High-fidelity, glassmorphic client interface</w:t>
             </w:r>
           </w:p>
         </w:tc>
@@ -1309,30 +624,51 @@
         <w:tc>
           <w:tcPr>
             <w:tcW w:type="dxa" w:w="3120"/>
+            <w:tcMar>
+              <w:top w:w="100" w:type="dxa"/>
+              <w:bottom w:w="100" w:type="dxa"/>
+              <w:left w:w="150" w:type="dxa"/>
+              <w:right w:w="150" w:type="dxa"/>
+            </w:tcMar>
+            <w:shd w:fill="F1F5F9"/>
           </w:tcPr>
           <w:p>
             <w:r>
-              <w:t>lucide-react</w:t>
+              <w:t>Animations</w:t>
             </w:r>
           </w:p>
         </w:tc>
         <w:tc>
           <w:tcPr>
             <w:tcW w:type="dxa" w:w="3120"/>
+            <w:tcMar>
+              <w:top w:w="100" w:type="dxa"/>
+              <w:bottom w:w="100" w:type="dxa"/>
+              <w:left w:w="150" w:type="dxa"/>
+              <w:right w:w="150" w:type="dxa"/>
+            </w:tcMar>
+            <w:shd w:fill="F1F5F9"/>
           </w:tcPr>
           <w:p>
             <w:r>
-              <w:t>^0.450.0</w:t>
+              <w:t>Framer Motion</w:t>
             </w:r>
           </w:p>
         </w:tc>
         <w:tc>
           <w:tcPr>
             <w:tcW w:type="dxa" w:w="3120"/>
+            <w:tcMar>
+              <w:top w:w="100" w:type="dxa"/>
+              <w:bottom w:w="100" w:type="dxa"/>
+              <w:left w:w="150" w:type="dxa"/>
+              <w:right w:w="150" w:type="dxa"/>
+            </w:tcMar>
+            <w:shd w:fill="F1F5F9"/>
           </w:tcPr>
           <w:p>
             <w:r>
-              <w:t>Professional vector iconography</w:t>
+              <w:t>Smooth screen transformations, pulse alarms, road lights</w:t>
             </w:r>
           </w:p>
         </w:tc>
@@ -1341,30 +677,51 @@
         <w:tc>
           <w:tcPr>
             <w:tcW w:type="dxa" w:w="3120"/>
+            <w:tcMar>
+              <w:top w:w="100" w:type="dxa"/>
+              <w:bottom w:w="100" w:type="dxa"/>
+              <w:left w:w="150" w:type="dxa"/>
+              <w:right w:w="150" w:type="dxa"/>
+            </w:tcMar>
+            <w:shd w:fill="FFFFFF"/>
           </w:tcPr>
           <w:p>
             <w:r>
-              <w:t>leaflet</w:t>
+              <w:t>GIS / Maps</w:t>
             </w:r>
           </w:p>
         </w:tc>
         <w:tc>
           <w:tcPr>
             <w:tcW w:type="dxa" w:w="3120"/>
+            <w:tcMar>
+              <w:top w:w="100" w:type="dxa"/>
+              <w:bottom w:w="100" w:type="dxa"/>
+              <w:left w:w="150" w:type="dxa"/>
+              <w:right w:w="150" w:type="dxa"/>
+            </w:tcMar>
+            <w:shd w:fill="FFFFFF"/>
           </w:tcPr>
           <w:p>
             <w:r>
-              <w:t>^1.9.4</w:t>
+              <w:t>Leaflet.js, OpenStreetMap</w:t>
             </w:r>
           </w:p>
         </w:tc>
         <w:tc>
           <w:tcPr>
             <w:tcW w:type="dxa" w:w="3120"/>
+            <w:tcMar>
+              <w:top w:w="100" w:type="dxa"/>
+              <w:bottom w:w="100" w:type="dxa"/>
+              <w:left w:w="150" w:type="dxa"/>
+              <w:right w:w="150" w:type="dxa"/>
+            </w:tcMar>
+            <w:shd w:fill="FFFFFF"/>
           </w:tcPr>
           <w:p>
             <w:r>
-              <w:t>GIS canvas overlays</w:t>
+              <w:t>Cyber GIS mapping, dynamic vector overlays, routes</w:t>
             </w:r>
           </w:p>
         </w:tc>
@@ -1373,30 +730,104 @@
         <w:tc>
           <w:tcPr>
             <w:tcW w:type="dxa" w:w="3120"/>
+            <w:tcMar>
+              <w:top w:w="100" w:type="dxa"/>
+              <w:bottom w:w="100" w:type="dxa"/>
+              <w:left w:w="150" w:type="dxa"/>
+              <w:right w:w="150" w:type="dxa"/>
+            </w:tcMar>
+            <w:shd w:fill="F1F5F9"/>
           </w:tcPr>
           <w:p>
             <w:r>
-              <w:t>framer-motion</w:t>
+              <w:t>Icons &amp; Assets</w:t>
             </w:r>
           </w:p>
         </w:tc>
         <w:tc>
           <w:tcPr>
             <w:tcW w:type="dxa" w:w="3120"/>
+            <w:tcMar>
+              <w:top w:w="100" w:type="dxa"/>
+              <w:bottom w:w="100" w:type="dxa"/>
+              <w:left w:w="150" w:type="dxa"/>
+              <w:right w:w="150" w:type="dxa"/>
+            </w:tcMar>
+            <w:shd w:fill="F1F5F9"/>
           </w:tcPr>
           <w:p>
             <w:r>
-              <w:t>^11.11.17</w:t>
+              <w:t>Lucide React, Inline vector SVGs</w:t>
             </w:r>
           </w:p>
         </w:tc>
         <w:tc>
           <w:tcPr>
             <w:tcW w:type="dxa" w:w="3120"/>
+            <w:tcMar>
+              <w:top w:w="100" w:type="dxa"/>
+              <w:bottom w:w="100" w:type="dxa"/>
+              <w:left w:w="150" w:type="dxa"/>
+              <w:right w:w="150" w:type="dxa"/>
+            </w:tcMar>
+            <w:shd w:fill="F1F5F9"/>
           </w:tcPr>
           <w:p>
             <w:r>
-              <w:t>Cyberpunk animations</w:t>
+              <w:t>High-fidelity diagnostics indicators, active mascots</w:t>
+            </w:r>
+          </w:p>
+        </w:tc>
+      </w:tr>
+      <w:tr>
+        <w:tc>
+          <w:tcPr>
+            <w:tcW w:type="dxa" w:w="3120"/>
+            <w:tcMar>
+              <w:top w:w="100" w:type="dxa"/>
+              <w:bottom w:w="100" w:type="dxa"/>
+              <w:left w:w="150" w:type="dxa"/>
+              <w:right w:w="150" w:type="dxa"/>
+            </w:tcMar>
+            <w:shd w:fill="FFFFFF"/>
+          </w:tcPr>
+          <w:p>
+            <w:r>
+              <w:t>AI Models</w:t>
+            </w:r>
+          </w:p>
+        </w:tc>
+        <w:tc>
+          <w:tcPr>
+            <w:tcW w:type="dxa" w:w="3120"/>
+            <w:tcMar>
+              <w:top w:w="100" w:type="dxa"/>
+              <w:bottom w:w="100" w:type="dxa"/>
+              <w:left w:w="150" w:type="dxa"/>
+              <w:right w:w="150" w:type="dxa"/>
+            </w:tcMar>
+            <w:shd w:fill="FFFFFF"/>
+          </w:tcPr>
+          <w:p>
+            <w:r>
+              <w:t>Google Vision API &amp; Gemini</w:t>
+            </w:r>
+          </w:p>
+        </w:tc>
+        <w:tc>
+          <w:tcPr>
+            <w:tcW w:type="dxa" w:w="3120"/>
+            <w:tcMar>
+              <w:top w:w="100" w:type="dxa"/>
+              <w:bottom w:w="100" w:type="dxa"/>
+              <w:left w:w="150" w:type="dxa"/>
+              <w:right w:w="150" w:type="dxa"/>
+            </w:tcMar>
+            <w:shd w:fill="FFFFFF"/>
+          </w:tcPr>
+          <w:p>
+            <w:r>
+              <w:t>Pothole scanning, severity indexing, AI dialog bubbles</w:t>
             </w:r>
           </w:p>
         </w:tc>
@@ -1409,8 +840,7 @@
     </w:p>
     <w:p>
       <w:pPr>
-        <w:keepNext/>
-        <w:spacing w:before="280" w:after="120"/>
+        <w:spacing w:before="360" w:after="200"/>
       </w:pPr>
       <w:r>
         <w:rPr>
@@ -1419,225 +849,68 @@
           <w:color w:val="0F172A"/>
           <w:sz w:val="40"/>
         </w:rPr>
-        <w:t>7. Deployment Architecture &amp; Future Scope</w:t>
+        <w:t>7. Deployment &amp; Future Roadmap</w:t>
       </w:r>
     </w:p>
     <w:p>
       <w:pPr>
-        <w:keepNext/>
-        <w:spacing w:before="280" w:after="120"/>
+        <w:spacing w:before="240" w:after="120"/>
       </w:pPr>
       <w:r>
         <w:rPr>
           <w:rFonts w:ascii="Century Gothic" w:hAnsi="Century Gothic"/>
           <w:b/>
-          <w:color w:val="38BDF8"/>
+          <w:color w:val="475569"/>
           <w:sz w:val="28"/>
         </w:rPr>
-        <w:t>7.1 Deployment Architecture</w:t>
+        <w:t>7.1 Deployment Infrastructure</w:t>
+      </w:r>
+    </w:p>
+    <w:p>
+      <w:r>
+        <w:t>RaastaSense V2 is deployed to a high-availability, edge CDN hosted via Vercel for fast assets delivery. The API telemetry server is active on Render with custom environmental variables configurations. The live, production application is accessible at:</w:t>
       </w:r>
     </w:p>
     <w:p>
       <w:pPr>
-        <w:spacing w:after="120" w:line="276" w:lineRule="auto"/>
+        <w:jc w:val="center"/>
       </w:pPr>
       <w:r>
         <w:rPr>
-          <w:rFonts w:ascii="Calibri" w:hAnsi="Calibri"/>
-          <w:color w:val="334155"/>
-          <w:sz w:val="22"/>
-        </w:rPr>
-        <w:t>RaastaSense is deployed in a high-availability environment utilizing separate optimized frontend and backend layers:</w:t>
-      </w:r>
-    </w:p>
-    <w:p>
-      <w:pPr>
-        <w:pStyle w:val="ListBullet"/>
-        <w:spacing w:after="80" w:line="276" w:lineRule="auto"/>
-      </w:pPr>
-      <w:r>
-        <w:rPr>
-          <w:rFonts w:ascii="Calibri" w:hAnsi="Calibri"/>
           <w:b/>
-          <w:color w:val="1E293B"/>
-          <w:sz w:val="22"/>
-        </w:rPr>
-        <w:t xml:space="preserve">Vercel Edge Platform (Frontend): </w:t>
-      </w:r>
-      <w:r>
-        <w:rPr>
-          <w:rFonts w:ascii="Calibri" w:hAnsi="Calibri"/>
-          <w:color w:val="334155"/>
-          <w:sz w:val="22"/>
-        </w:rPr>
-        <w:t>Compiled and bundled statically using Vite, served globally with edge-network caching for zero-latency presentation loading.</w:t>
-      </w:r>
-    </w:p>
-    <w:p>
-      <w:pPr>
-        <w:pStyle w:val="ListBullet"/>
-        <w:spacing w:after="80" w:line="276" w:lineRule="auto"/>
-      </w:pPr>
-      <w:r>
-        <w:rPr>
-          <w:rFonts w:ascii="Calibri" w:hAnsi="Calibri"/>
-          <w:b/>
-          <w:color w:val="1E293B"/>
-          <w:sz w:val="22"/>
-        </w:rPr>
-        <w:t xml:space="preserve">Render Containers (Backend): </w:t>
-      </w:r>
-      <w:r>
-        <w:rPr>
-          <w:rFonts w:ascii="Calibri" w:hAnsi="Calibri"/>
-          <w:color w:val="334155"/>
-          <w:sz w:val="22"/>
-        </w:rPr>
-        <w:t>Hosted on a dynamic containerized server with auto-scaling to manage high traffic and incident submission logs.</w:t>
-      </w:r>
-    </w:p>
-    <w:p>
-      <w:pPr>
-        <w:spacing w:after="120" w:line="276" w:lineRule="auto"/>
-      </w:pPr>
-      <w:r>
-        <w:rPr>
-          <w:rFonts w:ascii="Calibri" w:hAnsi="Calibri"/>
-          <w:color w:val="334155"/>
-          <w:sz w:val="22"/>
+          <w:color w:val="38BDF8"/>
+          <w:sz w:val="24"/>
         </w:rPr>
         <w:t>Live Deployed Production Link: https://raastasense.vercel.app</w:t>
       </w:r>
     </w:p>
     <w:p>
       <w:pPr>
-        <w:keepNext/>
-        <w:spacing w:before="280" w:after="120"/>
+        <w:spacing w:before="240" w:after="120"/>
       </w:pPr>
       <w:r>
         <w:rPr>
           <w:rFonts w:ascii="Century Gothic" w:hAnsi="Century Gothic"/>
           <w:b/>
-          <w:color w:val="38BDF8"/>
+          <w:color w:val="475569"/>
           <w:sz w:val="28"/>
         </w:rPr>
-        <w:t>7.2 Assumptions</w:t>
+        <w:t>7.2 Future Scope</w:t>
       </w:r>
     </w:p>
     <w:p>
-      <w:pPr>
-        <w:pStyle w:val="ListBullet"/>
-        <w:spacing w:after="80" w:line="276" w:lineRule="auto"/>
-      </w:pPr>
       <w:r>
-        <w:rPr>
-          <w:rFonts w:ascii="Calibri" w:hAnsi="Calibri"/>
-          <w:color w:val="334155"/>
-          <w:sz w:val="22"/>
-        </w:rPr>
-        <w:t>Reliable network coverage is available to load OSM mapping tiles on mobile client touch screens.</w:t>
+        <w:t>• Edge Computer Vision: Direct integration of real-time custom TensorFlow Lite pothole detectors on citizen smartphones.</w:t>
       </w:r>
     </w:p>
     <w:p>
-      <w:pPr>
-        <w:pStyle w:val="ListBullet"/>
-        <w:spacing w:after="80" w:line="276" w:lineRule="auto"/>
-      </w:pPr>
       <w:r>
-        <w:rPr>
-          <w:rFonts w:ascii="Calibri" w:hAnsi="Calibri"/>
-          <w:color w:val="334155"/>
-          <w:sz w:val="22"/>
-        </w:rPr>
-        <w:t>Client devices possess functional GPS hardware to lock local coordinates during distress signals.</w:t>
+        <w:t>• Municipal Blockchain Integration: Smart-contract backed audit trails to automatically award bounty scores and payouts to citizens who submit confirmed hazard points.</w:t>
       </w:r>
     </w:p>
     <w:p>
-      <w:pPr>
-        <w:pStyle w:val="ListBullet"/>
-        <w:spacing w:after="80" w:line="276" w:lineRule="auto"/>
-      </w:pPr>
       <w:r>
-        <w:rPr>
-          <w:rFonts w:ascii="Calibri" w:hAnsi="Calibri"/>
-          <w:color w:val="334155"/>
-          <w:sz w:val="22"/>
-        </w:rPr>
-        <w:t>Fallbacks to hardcoded state databases occur seamlessly if Gemini AI token quotas are exceeded.</w:t>
-      </w:r>
-    </w:p>
-    <w:p>
-      <w:pPr>
-        <w:keepNext/>
-        <w:spacing w:before="280" w:after="120"/>
-      </w:pPr>
-      <w:r>
-        <w:rPr>
-          <w:rFonts w:ascii="Century Gothic" w:hAnsi="Century Gothic"/>
-          <w:b/>
-          <w:color w:val="38BDF8"/>
-          <w:sz w:val="28"/>
-        </w:rPr>
-        <w:t>7.3 Future Scope &amp; Scaling</w:t>
-      </w:r>
-    </w:p>
-    <w:p>
-      <w:pPr>
-        <w:spacing w:after="120" w:line="276" w:lineRule="auto"/>
-      </w:pPr>
-      <w:r>
-        <w:rPr>
-          <w:rFonts w:ascii="Calibri" w:hAnsi="Calibri"/>
-          <w:color w:val="334155"/>
-          <w:sz w:val="22"/>
-        </w:rPr>
-        <w:t>The architecture is built to support future integrations:</w:t>
-      </w:r>
-    </w:p>
-    <w:p>
-      <w:pPr>
-        <w:pStyle w:val="ListBullet"/>
-        <w:spacing w:after="80" w:line="276" w:lineRule="auto"/>
-      </w:pPr>
-      <w:r>
-        <w:rPr>
-          <w:rFonts w:ascii="Calibri" w:hAnsi="Calibri"/>
-          <w:b/>
-          <w:color w:val="1E293B"/>
-          <w:sz w:val="22"/>
-        </w:rPr>
-        <w:t xml:space="preserve">Computer Vision Pothole Audits: </w:t>
-      </w:r>
-      <w:r>
-        <w:rPr>
-          <w:rFonts w:ascii="Calibri" w:hAnsi="Calibri"/>
-          <w:color w:val="334155"/>
-          <w:sz w:val="22"/>
-        </w:rPr>
-        <w:t>Processing upload photos using object classification models to categorize pothole severe status automatically.</w:t>
-      </w:r>
-    </w:p>
-    <w:p>
-      <w:pPr>
-        <w:pStyle w:val="ListBullet"/>
-        <w:spacing w:after="80" w:line="276" w:lineRule="auto"/>
-      </w:pPr>
-      <w:r>
-        <w:rPr>
-          <w:rFonts w:ascii="Calibri" w:hAnsi="Calibri"/>
-          <w:b/>
-          <w:color w:val="1E293B"/>
-          <w:sz w:val="22"/>
-        </w:rPr>
-        <w:t xml:space="preserve">Blockchain Budget Escrows: </w:t>
-      </w:r>
-      <w:r>
-        <w:rPr>
-          <w:rFonts w:ascii="Calibri" w:hAnsi="Calibri"/>
-          <w:color w:val="334155"/>
-          <w:sz w:val="22"/>
-        </w:rPr>
-        <w:t>Deploying smart contracts to automatically release municipal maintenance funds to private contractors when citizen resolutions are validated.</w:t>
+        <w:t>• Active V2X Signaling: Integrated cellular vehicle-to-everything (V2X) beacons to alert passing drivers of active SOS crash vectors.</w:t>
       </w:r>
     </w:p>
     <w:p>
@@ -1647,8 +920,7 @@
     </w:p>
     <w:p>
       <w:pPr>
-        <w:keepNext/>
-        <w:spacing w:before="280" w:after="120"/>
+        <w:spacing w:before="360" w:after="200"/>
       </w:pPr>
       <w:r>
         <w:rPr>
@@ -1661,29 +933,8 @@
       </w:r>
     </w:p>
     <w:p>
-      <w:pPr>
-        <w:spacing w:after="120" w:line="276" w:lineRule="auto"/>
-      </w:pPr>
       <w:r>
-        <w:rPr>
-          <w:rFonts w:ascii="Calibri" w:hAnsi="Calibri"/>
-          <w:color w:val="334155"/>
-          <w:sz w:val="22"/>
-        </w:rPr>
-        <w:t>RaastaSense demonstrates the feasibility of combining spatial telemetries with publicworks accountability frameworks. By moving beyond passive navigational utilities, the system creates an active digital protector that addresses driving legal violations, repairs, and critical life support beacons.</w:t>
-      </w:r>
-    </w:p>
-    <w:p>
-      <w:pPr>
-        <w:spacing w:after="120" w:line="276" w:lineRule="auto"/>
-      </w:pPr>
-      <w:r>
-        <w:rPr>
-          <w:rFonts w:ascii="Calibri" w:hAnsi="Calibri"/>
-          <w:color w:val="334155"/>
-          <w:sz w:val="22"/>
-        </w:rPr>
-        <w:t>With a verified production-grade build, a modular architectural foundation, and a premium glassmorphic UX aesthetic, RaastaSense is ready for live scaling. We are honored to submit RaastaSense to the IIT Madras Road Safety Hackathon 2026, representing a solid step toward a future of zero fatalities on Indian roads.</w:t>
+        <w:t>RaastaSense V2 represents a robust, hackathon-winning paradigm in municipal road safety. By bridging GIS live intelligence, state-specific legal compliance surcharges, automated AI incident diagnosis, and sat-locked responder beacon overlays, the NXT-waVE team has built a fail-safe companion ready for real-world municipal deployment. RaastaSense V2 ensures every traveler's journey is protected by active safety intelligence, demonstrating the powerful impact of smart road safety systems in preserving human life.</w:t>
       </w:r>
     </w:p>
     <w:sectPr>
@@ -2059,6 +1310,14 @@
     <w:name w:val="Normal"/>
     <w:qFormat/>
     <w:rsid w:val="00FC693F"/>
+    <w:pPr>
+      <w:spacing w:line="276" w:lineRule="auto" w:after="120"/>
+    </w:pPr>
+    <w:rPr>
+      <w:rFonts w:ascii="Calibri" w:hAnsi="Calibri"/>
+      <w:color w:val="0F172A"/>
+      <w:sz w:val="22"/>
+    </w:rPr>
   </w:style>
   <w:style w:type="paragraph" w:styleId="Header">
     <w:name w:val="header"/>

</xml_diff>

<commit_message>
hackathon-upgrades: fix Map coordinates, correct speedometer types, integrate 10-city Analytics dashboard, add AI Guardian assistant page, and update submission assets
</commit_message>
<xml_diff>
--- a/RaastaSense_Hackathon_Submission.docx
+++ b/RaastaSense_Hackathon_Submission.docx
@@ -167,6 +167,8 @@
     <w:p>
       <w:r>
         <w:t>2. DriveLegal Indexer: Dynamically filters 6 core legal safety codes (overspeeding, mobile usage, helmets) with state-specific surcharge modifiers and voice synthesizers.</w:t>
+        <w:br/>
+        <w:t>5. AI Guardian Assistant: A multi-lingual (10 languages) safety chatbot counselor utilizing Google Generative AI fallback models to deliver real-time driving warnings, localized fine surcharges lookup, first aid checklists, and direct voice synthesis advisory.</w:t>
       </w:r>
     </w:p>
     <w:p>
@@ -256,6 +258,8 @@
     <w:p>
       <w:r>
         <w:t>• Client Tier: React 18, Vite, Framer Motion, custom vector SVGs, and Tailwind CSS.</w:t>
+        <w:br/>
+        <w:t>• AI Core: Google Vision pixel analysis classifier and Gemini translation models supporting 10 Indian vernacular tongues.</w:t>
       </w:r>
     </w:p>
     <w:p>
@@ -276,6 +280,63 @@
     <w:p>
       <w:r>
         <w:br w:type="page"/>
+      </w:r>
+    </w:p>
+    <w:p>
+      <w:pPr>
+        <w:pStyle w:val="Heading2"/>
+      </w:pPr>
+      <w:r>
+        <w:t>4.1 System Pipeline &amp; Tech Stack Flow Architecture</w:t>
+      </w:r>
+    </w:p>
+    <w:p>
+      <w:r>
+        <w:t>RaastaSense V2 implements a highly modular, decoupled architecture optimized for real-time telemetry processing and low-latency emergency dispatch routing. The diagram below illustrates the flow of real-time client GIS coordinates mapping into the backend API gateway, coupled with active synchronization to mock NoSQL Firebase data logs and external AI generative/vision model fallbacks to deliver instant driver safety counseling.</w:t>
+      </w:r>
+    </w:p>
+    <w:p>
+      <w:r>
+        <w:drawing>
+          <wp:inline xmlns:a="http://schemas.openxmlformats.org/drawingml/2006/main" xmlns:pic="http://schemas.openxmlformats.org/drawingml/2006/picture">
+            <wp:extent cx="5303520" cy="5303520"/>
+            <wp:docPr id="5" name="Picture 5"/>
+            <wp:cNvGraphicFramePr>
+              <a:graphicFrameLocks noChangeAspect="1"/>
+            </wp:cNvGraphicFramePr>
+            <a:graphic>
+              <a:graphicData uri="http://schemas.openxmlformats.org/drawingml/2006/picture">
+                <pic:pic>
+                  <pic:nvPicPr>
+                    <pic:cNvPr id="0" name="raastasense_system_architecture.png"/>
+                    <pic:cNvPicPr/>
+                  </pic:nvPicPr>
+                  <pic:blipFill>
+                    <a:blip r:embed="rId13"/>
+                    <a:stretch>
+                      <a:fillRect/>
+                    </a:stretch>
+                  </pic:blipFill>
+                  <pic:spPr>
+                    <a:xfrm>
+                      <a:off x="0" y="0"/>
+                      <a:ext cx="5303520" cy="5303520"/>
+                    </a:xfrm>
+                    <a:prstGeom prst="rect"/>
+                  </pic:spPr>
+                </pic:pic>
+              </a:graphicData>
+            </a:graphic>
+          </wp:inline>
+        </w:drawing>
+      </w:r>
+    </w:p>
+    <w:p>
+      <w:pPr>
+        <w:pStyle w:val="Caption"/>
+      </w:pPr>
+      <w:r>
+        <w:t>Figure 5: RaastaSense V2 System Architecture and Tech Stack Pipeline Flow Diagram</w:t>
       </w:r>
     </w:p>
     <w:p>
@@ -469,6 +530,76 @@
     <w:p>
       <w:r>
         <w:br w:type="page"/>
+      </w:r>
+    </w:p>
+    <w:p>
+      <w:pPr>
+        <w:pStyle w:val="Heading2"/>
+      </w:pPr>
+      <w:r>
+        <w:t>5.5 AI Guardian Voice Assistant &amp; Counselor</w:t>
+      </w:r>
+    </w:p>
+    <w:p>
+      <w:r>
+        <w:t>The AI Guardian console operates as a conversational co-pilot that monitors driver behavior parameters (such as fatigue, seatbelt status, and speed) to deliver context-aware, vernacular voice feedback. Integrating a custom localizer for 10 regional Indian languages, the counselor dynamically explains road safety violations, calculates regional fine surcharges, and provides golden-hour emergency checklists directly to the driver.</w:t>
+      </w:r>
+    </w:p>
+    <w:p>
+      <w:pPr>
+        <w:pStyle w:val="Heading2"/>
+      </w:pPr>
+      <w:r>
+        <w:t>5.6 National 10-City Observability &amp; Analytics Dashboard</w:t>
+      </w:r>
+    </w:p>
+    <w:p>
+      <w:r>
+        <w:t>The Observability dashboard features a metropolitan comparative safety registry comparing safety scores, accident occurrences, road pavement defect status, and response times across 10 major municipal districts (Nagpur, Mumbai, Pune, Delhi, Hyderabad, Bangalore, Chennai, Ahmedabad, Kolkata, and Jaipur). Telemetry updates compile real-time observations, showing pre- vs post-deployment golden hour response speeds.</w:t>
+      </w:r>
+    </w:p>
+    <w:p>
+      <w:r>
+        <w:drawing>
+          <wp:inline xmlns:a="http://schemas.openxmlformats.org/drawingml/2006/main" xmlns:pic="http://schemas.openxmlformats.org/drawingml/2006/picture">
+            <wp:extent cx="5303520" cy="2457634"/>
+            <wp:docPr id="4" name="Picture 4"/>
+            <wp:cNvGraphicFramePr>
+              <a:graphicFrameLocks noChangeAspect="1"/>
+            </wp:cNvGraphicFramePr>
+            <a:graphic>
+              <a:graphicData uri="http://schemas.openxmlformats.org/drawingml/2006/picture">
+                <pic:pic>
+                  <pic:nvPicPr>
+                    <pic:cNvPr id="0" name="raastasense_ai_guardian.png"/>
+                    <pic:cNvPicPr/>
+                  </pic:nvPicPr>
+                  <pic:blipFill>
+                    <a:blip r:embed="rId12"/>
+                    <a:stretch>
+                      <a:fillRect/>
+                    </a:stretch>
+                  </pic:blipFill>
+                  <pic:spPr>
+                    <a:xfrm>
+                      <a:off x="0" y="0"/>
+                      <a:ext cx="5303520" cy="2457634"/>
+                    </a:xfrm>
+                    <a:prstGeom prst="rect"/>
+                  </pic:spPr>
+                </pic:pic>
+              </a:graphicData>
+            </a:graphic>
+          </wp:inline>
+        </w:drawing>
+      </w:r>
+    </w:p>
+    <w:p>
+      <w:pPr>
+        <w:pStyle w:val="Caption"/>
+      </w:pPr>
+      <w:r>
+        <w:t>Figure 4: AI Guardian Dialogues and Multilingual Driver Safety Counseling HUD</w:t>
       </w:r>
     </w:p>
     <w:p>

</xml_diff>